<commit_message>
added github links to documentation and presentation
</commit_message>
<xml_diff>
--- a/docs/documentation_bg.docx
+++ b/docs/documentation_bg.docx
@@ -21,13 +21,54 @@
     </w:p>
     <w:p>
       <w:pPr>
+        <w:spacing w:after="120"/>
         <w:jc w:val="center"/>
+        <w:rPr>
+          <w:lang w:val="en-US"/>
+        </w:rPr>
       </w:pPr>
       <w:r>
         <w:t>От Михаил Димитров (3MI0600472) и Мирослав Балев (9MI0600470)</w:t>
       </w:r>
     </w:p>
-    <w:p/>
+    <w:p>
+      <w:pPr>
+        <w:spacing w:after="120"/>
+        <w:jc w:val="center"/>
+        <w:rPr>
+          <w:lang w:val="en-US"/>
+        </w:rPr>
+      </w:pPr>
+      <w:proofErr w:type="spellStart"/>
+      <w:r>
+        <w:rPr>
+          <w:lang w:val="en-US"/>
+        </w:rPr>
+        <w:t>Github</w:t>
+      </w:r>
+      <w:proofErr w:type="spellEnd"/>
+      <w:r>
+        <w:rPr>
+          <w:lang w:val="en-US"/>
+        </w:rPr>
+        <w:t xml:space="preserve">: </w:t>
+      </w:r>
+      <w:hyperlink r:id="rId5" w:history="1">
+        <w:r>
+          <w:rPr>
+            <w:rStyle w:val="Hyperlink"/>
+            <w:lang w:val="en-US"/>
+          </w:rPr>
+          <w:t>https://github.com/MihailDimitrov1235/online-tech-marketplace</w:t>
+        </w:r>
+      </w:hyperlink>
+      <w:r>
+        <w:rPr>
+          <w:lang w:val="en-US"/>
+        </w:rPr>
+        <w:t xml:space="preserve"> </w:t>
+      </w:r>
+    </w:p>
     <w:p>
       <w:pPr>
         <w:pStyle w:val="Heading2"/>
@@ -648,10 +689,7 @@
         </w:numPr>
       </w:pPr>
       <w:r>
-        <w:t>Buyer</w:t>
-      </w:r>
-      <w:r>
-        <w:t xml:space="preserve"> — </w:t>
+        <w:t xml:space="preserve">Buyer — </w:t>
       </w:r>
       <w:proofErr w:type="spellStart"/>
       <w:r>
@@ -727,10 +765,7 @@
         </w:numPr>
       </w:pPr>
       <w:r>
-        <w:t>Seller</w:t>
-      </w:r>
-      <w:r>
-        <w:t xml:space="preserve"> — </w:t>
+        <w:t xml:space="preserve">Seller — </w:t>
       </w:r>
       <w:proofErr w:type="spellStart"/>
       <w:r>
@@ -798,10 +833,7 @@
         </w:numPr>
       </w:pPr>
       <w:r>
-        <w:t>Delivery</w:t>
-      </w:r>
-      <w:r>
-        <w:t xml:space="preserve"> — </w:t>
+        <w:t xml:space="preserve">Delivery — </w:t>
       </w:r>
       <w:proofErr w:type="spellStart"/>
       <w:r>
@@ -1098,13 +1130,7 @@
         <w:ind w:left="1134"/>
       </w:pPr>
       <w:r>
-        <w:t>Уникална функционалност на платформата е възможността за създаване на конфигурации.</w:t>
-      </w:r>
-      <w:r>
-        <w:t xml:space="preserve"> </w:t>
-      </w:r>
-      <w:r>
-        <w:t>Конфигурацията представлява набор от технологии, обединени в един пакет:</w:t>
+        <w:t>Уникална функционалност на платформата е възможността за създаване на конфигурации. Конфигурацията представлява набор от технологии, обединени в един пакет:</w:t>
       </w:r>
     </w:p>
     <w:p>
@@ -5624,7 +5650,6 @@
   <w:style w:type="character" w:default="1" w:styleId="DefaultParagraphFont">
     <w:name w:val="Default Paragraph Font"/>
     <w:uiPriority w:val="1"/>
-    <w:semiHidden/>
     <w:unhideWhenUsed/>
   </w:style>
   <w:style w:type="table" w:default="1" w:styleId="TableNormal">
@@ -5965,6 +5990,29 @@
       <w14:ligatures w14:val="none"/>
     </w:rPr>
   </w:style>
+  <w:style w:type="character" w:styleId="Hyperlink">
+    <w:name w:val="Hyperlink"/>
+    <w:basedOn w:val="DefaultParagraphFont"/>
+    <w:uiPriority w:val="99"/>
+    <w:unhideWhenUsed/>
+    <w:rsid w:val="00727EF5"/>
+    <w:rPr>
+      <w:color w:val="467886" w:themeColor="hyperlink"/>
+      <w:u w:val="single"/>
+    </w:rPr>
+  </w:style>
+  <w:style w:type="character" w:styleId="UnresolvedMention">
+    <w:name w:val="Unresolved Mention"/>
+    <w:basedOn w:val="DefaultParagraphFont"/>
+    <w:uiPriority w:val="99"/>
+    <w:semiHidden/>
+    <w:unhideWhenUsed/>
+    <w:rsid w:val="00727EF5"/>
+    <w:rPr>
+      <w:color w:val="605E5C"/>
+      <w:shd w:val="clear" w:color="auto" w:fill="E1DFDD"/>
+    </w:rPr>
+  </w:style>
 </w:styles>
 </file>
 

</xml_diff>